<commit_message>
Update documentation for Sprint 05 and Sprint 06, including adjustments to planned vs. actual metrics, retrospective details, and test execution reports. Corrected dates and improved formatting for clarity. Added summaries of completed tasks and commitments for better tracking of progress.
</commit_message>
<xml_diff>
--- a/Documentos Base/Sprint 4 documentacion/Sprint_04_Planificado_Realizado_ICARO.docx
+++ b/Documentos Base/Sprint 4 documentacion/Sprint_04_Planificado_Realizado_ICARO.docx
@@ -577,15 +577,7 @@
                 <w:color w:val="000000"/>
                 <w:szCs w:val="28"/>
               </w:rPr>
-              <w:t>09</w:t>
-            </w:r>
-            <w:r>
-              <w:rPr>
-                <w:rFonts w:asciiTheme="majorHAnsi" w:hAnsiTheme="majorHAnsi" w:cstheme="majorHAnsi"/>
-                <w:color w:val="000000"/>
-                <w:szCs w:val="28"/>
-              </w:rPr>
-              <w:t>/05/2026</w:t>
+              <w:t>09/05/2026</w:t>
             </w:r>
           </w:p>
         </w:tc>
@@ -3925,13 +3917,13 @@
         <w:tblLook w:val="04A0" w:firstRow="1" w:lastRow="0" w:firstColumn="1" w:lastColumn="0" w:noHBand="0" w:noVBand="1"/>
       </w:tblPr>
       <w:tblGrid>
-        <w:gridCol w:w="3369"/>
-        <w:gridCol w:w="5271"/>
+        <w:gridCol w:w="3085"/>
+        <w:gridCol w:w="5555"/>
       </w:tblGrid>
       <w:tr>
         <w:tc>
           <w:tcPr>
-            <w:tcW w:w="3369" w:type="dxa"/>
+            <w:tcW w:w="3085" w:type="dxa"/>
             <w:shd w:val="clear" w:color="auto" w:fill="D9E1F2"/>
           </w:tcPr>
           <w:p>
@@ -3951,7 +3943,7 @@
         </w:tc>
         <w:tc>
           <w:tcPr>
-            <w:tcW w:w="5271" w:type="dxa"/>
+            <w:tcW w:w="5555" w:type="dxa"/>
           </w:tcPr>
           <w:p>
             <w:pPr>
@@ -3971,7 +3963,7 @@
       <w:tr>
         <w:tc>
           <w:tcPr>
-            <w:tcW w:w="3369" w:type="dxa"/>
+            <w:tcW w:w="3085" w:type="dxa"/>
             <w:shd w:val="clear" w:color="auto" w:fill="D9E1F2"/>
           </w:tcPr>
           <w:p>
@@ -3991,7 +3983,7 @@
         </w:tc>
         <w:tc>
           <w:tcPr>
-            <w:tcW w:w="5271" w:type="dxa"/>
+            <w:tcW w:w="5555" w:type="dxa"/>
           </w:tcPr>
           <w:p>
             <w:pPr>
@@ -4011,7 +4003,7 @@
       <w:tr>
         <w:tc>
           <w:tcPr>
-            <w:tcW w:w="3369" w:type="dxa"/>
+            <w:tcW w:w="3085" w:type="dxa"/>
             <w:shd w:val="clear" w:color="auto" w:fill="D9E1F2"/>
           </w:tcPr>
           <w:p>
@@ -4031,7 +4023,7 @@
         </w:tc>
         <w:tc>
           <w:tcPr>
-            <w:tcW w:w="5271" w:type="dxa"/>
+            <w:tcW w:w="5555" w:type="dxa"/>
           </w:tcPr>
           <w:p>
             <w:pPr>
@@ -4058,7 +4050,7 @@
       <w:tr>
         <w:tc>
           <w:tcPr>
-            <w:tcW w:w="3369" w:type="dxa"/>
+            <w:tcW w:w="3085" w:type="dxa"/>
             <w:shd w:val="clear" w:color="auto" w:fill="D9E1F2"/>
           </w:tcPr>
           <w:p>
@@ -4078,7 +4070,7 @@
         </w:tc>
         <w:tc>
           <w:tcPr>
-            <w:tcW w:w="5271" w:type="dxa"/>
+            <w:tcW w:w="5555" w:type="dxa"/>
           </w:tcPr>
           <w:p>
             <w:pPr>

</xml_diff>

<commit_message>
Cambios de sprint 4, 5,6,7
</commit_message>
<xml_diff>
--- a/Documentos Base/Sprint 4 documentacion/Sprint_04_Planificado_Realizado_ICARO.docx
+++ b/Documentos Base/Sprint 4 documentacion/Sprint_04_Planificado_Realizado_ICARO.docx
@@ -441,7 +441,6 @@
           </w:tcPr>
           <w:p>
             <w:pPr>
-              <w:jc w:val="center"/>
               <w:rPr>
                 <w:rFonts w:asciiTheme="majorHAnsi" w:hAnsiTheme="majorHAnsi" w:cstheme="majorHAnsi"/>
                 <w:szCs w:val="28"/>
@@ -466,7 +465,6 @@
           </w:tcPr>
           <w:p>
             <w:pPr>
-              <w:jc w:val="center"/>
               <w:rPr>
                 <w:rFonts w:asciiTheme="majorHAnsi" w:hAnsiTheme="majorHAnsi" w:cstheme="majorHAnsi"/>
                 <w:szCs w:val="28"/>
@@ -491,7 +489,6 @@
           </w:tcPr>
           <w:p>
             <w:pPr>
-              <w:jc w:val="center"/>
               <w:rPr>
                 <w:rFonts w:asciiTheme="majorHAnsi" w:hAnsiTheme="majorHAnsi" w:cstheme="majorHAnsi"/>
                 <w:szCs w:val="28"/>
@@ -516,7 +513,6 @@
           </w:tcPr>
           <w:p>
             <w:pPr>
-              <w:jc w:val="center"/>
               <w:rPr>
                 <w:rFonts w:asciiTheme="majorHAnsi" w:hAnsiTheme="majorHAnsi" w:cstheme="majorHAnsi"/>
                 <w:szCs w:val="28"/>
@@ -542,7 +538,6 @@
           </w:tcPr>
           <w:p>
             <w:pPr>
-              <w:jc w:val="center"/>
               <w:rPr>
                 <w:rFonts w:asciiTheme="majorHAnsi" w:hAnsiTheme="majorHAnsi" w:cstheme="majorHAnsi"/>
                 <w:szCs w:val="28"/>
@@ -565,7 +560,6 @@
           </w:tcPr>
           <w:p>
             <w:pPr>
-              <w:jc w:val="center"/>
               <w:rPr>
                 <w:rFonts w:asciiTheme="majorHAnsi" w:hAnsiTheme="majorHAnsi" w:cstheme="majorHAnsi"/>
                 <w:szCs w:val="28"/>
@@ -588,7 +582,6 @@
           </w:tcPr>
           <w:p>
             <w:pPr>
-              <w:jc w:val="center"/>
               <w:rPr>
                 <w:rFonts w:asciiTheme="majorHAnsi" w:hAnsiTheme="majorHAnsi" w:cstheme="majorHAnsi"/>
                 <w:szCs w:val="28"/>
@@ -611,7 +604,6 @@
           </w:tcPr>
           <w:p>
             <w:pPr>
-              <w:jc w:val="center"/>
               <w:rPr>
                 <w:rFonts w:asciiTheme="majorHAnsi" w:hAnsiTheme="majorHAnsi" w:cstheme="majorHAnsi"/>
                 <w:szCs w:val="28"/>
@@ -3930,12 +3922,16 @@
             <w:pPr>
               <w:rPr>
                 <w:rFonts w:asciiTheme="majorHAnsi" w:hAnsiTheme="majorHAnsi" w:cstheme="majorHAnsi"/>
+                <w:sz w:val="20"/>
+                <w:szCs w:val="20"/>
               </w:rPr>
             </w:pPr>
             <w:r>
               <w:rPr>
                 <w:rFonts w:asciiTheme="majorHAnsi" w:hAnsiTheme="majorHAnsi" w:cstheme="majorHAnsi"/>
                 <w:b/>
+                <w:sz w:val="20"/>
+                <w:szCs w:val="20"/>
               </w:rPr>
               <w:t>Factores que influyeron positivamente</w:t>
             </w:r>
@@ -3949,11 +3945,15 @@
             <w:pPr>
               <w:rPr>
                 <w:rFonts w:asciiTheme="majorHAnsi" w:hAnsiTheme="majorHAnsi" w:cstheme="majorHAnsi"/>
-              </w:rPr>
-            </w:pPr>
-            <w:r>
-              <w:rPr>
-                <w:rFonts w:asciiTheme="majorHAnsi" w:hAnsiTheme="majorHAnsi" w:cstheme="majorHAnsi"/>
+                <w:sz w:val="20"/>
+                <w:szCs w:val="20"/>
+              </w:rPr>
+            </w:pPr>
+            <w:r>
+              <w:rPr>
+                <w:rFonts w:asciiTheme="majorHAnsi" w:hAnsiTheme="majorHAnsi" w:cstheme="majorHAnsi"/>
+                <w:sz w:val="20"/>
+                <w:szCs w:val="20"/>
               </w:rPr>
               <w:t>La separación de capas (service vs controller) facilitó la implementación del flujo de aprobación/rechazo. La reutilización del patrón RBAC establecido en sprints anteriores aceleró el desarrollo.</w:t>
             </w:r>
@@ -3970,12 +3970,16 @@
             <w:pPr>
               <w:rPr>
                 <w:rFonts w:asciiTheme="majorHAnsi" w:hAnsiTheme="majorHAnsi" w:cstheme="majorHAnsi"/>
+                <w:sz w:val="20"/>
+                <w:szCs w:val="20"/>
               </w:rPr>
             </w:pPr>
             <w:r>
               <w:rPr>
                 <w:rFonts w:asciiTheme="majorHAnsi" w:hAnsiTheme="majorHAnsi" w:cstheme="majorHAnsi"/>
                 <w:b/>
+                <w:sz w:val="20"/>
+                <w:szCs w:val="20"/>
               </w:rPr>
               <w:t>Factores que afectaron negativamente</w:t>
             </w:r>
@@ -3989,11 +3993,15 @@
             <w:pPr>
               <w:rPr>
                 <w:rFonts w:asciiTheme="majorHAnsi" w:hAnsiTheme="majorHAnsi" w:cstheme="majorHAnsi"/>
-              </w:rPr>
-            </w:pPr>
-            <w:r>
-              <w:rPr>
-                <w:rFonts w:asciiTheme="majorHAnsi" w:hAnsiTheme="majorHAnsi" w:cstheme="majorHAnsi"/>
+                <w:sz w:val="20"/>
+                <w:szCs w:val="20"/>
+              </w:rPr>
+            </w:pPr>
+            <w:r>
+              <w:rPr>
+                <w:rFonts w:asciiTheme="majorHAnsi" w:hAnsiTheme="majorHAnsi" w:cstheme="majorHAnsi"/>
+                <w:sz w:val="20"/>
+                <w:szCs w:val="20"/>
               </w:rPr>
               <w:t>El endpoint de reactivación de materiales (HT-09) requirió ajustes en el middleware de validación para manejar el campo activo:true correctamente.</w:t>
             </w:r>
@@ -4010,12 +4018,16 @@
             <w:pPr>
               <w:rPr>
                 <w:rFonts w:asciiTheme="majorHAnsi" w:hAnsiTheme="majorHAnsi" w:cstheme="majorHAnsi"/>
+                <w:sz w:val="20"/>
+                <w:szCs w:val="20"/>
               </w:rPr>
             </w:pPr>
             <w:r>
               <w:rPr>
                 <w:rFonts w:asciiTheme="majorHAnsi" w:hAnsiTheme="majorHAnsi" w:cstheme="majorHAnsi"/>
                 <w:b/>
+                <w:sz w:val="20"/>
+                <w:szCs w:val="20"/>
               </w:rPr>
               <w:t>Lecciones aprendidas clave</w:t>
             </w:r>
@@ -4029,17 +4041,23 @@
             <w:pPr>
               <w:rPr>
                 <w:rFonts w:asciiTheme="majorHAnsi" w:hAnsiTheme="majorHAnsi" w:cstheme="majorHAnsi"/>
-              </w:rPr>
-            </w:pPr>
-            <w:r>
-              <w:rPr>
-                <w:rFonts w:asciiTheme="majorHAnsi" w:hAnsiTheme="majorHAnsi" w:cstheme="majorHAnsi"/>
+                <w:sz w:val="20"/>
+                <w:szCs w:val="20"/>
+              </w:rPr>
+            </w:pPr>
+            <w:r>
+              <w:rPr>
+                <w:rFonts w:asciiTheme="majorHAnsi" w:hAnsiTheme="majorHAnsi" w:cstheme="majorHAnsi"/>
+                <w:sz w:val="20"/>
+                <w:szCs w:val="20"/>
               </w:rPr>
               <w:t>1. La validación de estado previo antes de aprobar/rechazar un requerimiento evita inconsistencias en el flujo.</w:t>
             </w:r>
             <w:r>
               <w:rPr>
                 <w:rFonts w:asciiTheme="majorHAnsi" w:hAnsiTheme="majorHAnsi" w:cstheme="majorHAnsi"/>
+                <w:sz w:val="20"/>
+                <w:szCs w:val="20"/>
               </w:rPr>
               <w:br/>
               <w:t>2. Los tests de integración deben cubrir todos los roles RBAC para garantizar correctitud del control de acceso.</w:t>
@@ -4057,12 +4075,16 @@
             <w:pPr>
               <w:rPr>
                 <w:rFonts w:asciiTheme="majorHAnsi" w:hAnsiTheme="majorHAnsi" w:cstheme="majorHAnsi"/>
+                <w:sz w:val="20"/>
+                <w:szCs w:val="20"/>
               </w:rPr>
             </w:pPr>
             <w:r>
               <w:rPr>
                 <w:rFonts w:asciiTheme="majorHAnsi" w:hAnsiTheme="majorHAnsi" w:cstheme="majorHAnsi"/>
                 <w:b/>
+                <w:sz w:val="20"/>
+                <w:szCs w:val="20"/>
               </w:rPr>
               <w:t>Compromisos para el siguiente sprint</w:t>
             </w:r>
@@ -4076,11 +4098,15 @@
             <w:pPr>
               <w:rPr>
                 <w:rFonts w:asciiTheme="majorHAnsi" w:hAnsiTheme="majorHAnsi" w:cstheme="majorHAnsi"/>
-              </w:rPr>
-            </w:pPr>
-            <w:r>
-              <w:rPr>
-                <w:rFonts w:asciiTheme="majorHAnsi" w:hAnsiTheme="majorHAnsi" w:cstheme="majorHAnsi"/>
+                <w:sz w:val="20"/>
+                <w:szCs w:val="20"/>
+              </w:rPr>
+            </w:pPr>
+            <w:r>
+              <w:rPr>
+                <w:rFonts w:asciiTheme="majorHAnsi" w:hAnsiTheme="majorHAnsi" w:cstheme="majorHAnsi"/>
+                <w:sz w:val="20"/>
+                <w:szCs w:val="20"/>
               </w:rPr>
               <w:t>Implementar el módulo de Planilla Mensual de Obra y el cierre contable mensual (Sprint 05).</w:t>
             </w:r>
@@ -4093,7 +4119,7 @@
         <w:pStyle w:val="Ttulo1"/>
       </w:pPr>
       <w:r>
-        <w:t>Glosario de Siglas</w:t>
+        <w:t xml:space="preserve">7. </w:t>
       </w:r>
     </w:p>
     <w:tbl>
@@ -4469,7 +4495,6 @@
                 <w:color w:val="000000"/>
                 <w:szCs w:val="28"/>
               </w:rPr>
-              <w:lastRenderedPageBreak/>
               <w:t>BD</w:t>
             </w:r>
           </w:p>
@@ -4556,6 +4581,7 @@
                 <w:color w:val="000000"/>
                 <w:szCs w:val="28"/>
               </w:rPr>
+              <w:lastRenderedPageBreak/>
               <w:t>CRUD</w:t>
             </w:r>
           </w:p>
@@ -5228,8 +5254,9 @@
   <w:style w:type="paragraph" w:default="1" w:styleId="Normal">
     <w:name w:val="Normal"/>
     <w:qFormat/>
-    <w:rsid w:val="00FC693F"/>
+    <w:rsid w:val="00955C89"/>
     <w:rPr>
+      <w:rFonts w:ascii="Calibri" w:hAnsi="Calibri"/>
       <w:lang w:val="es-EC"/>
     </w:rPr>
   </w:style>

</xml_diff>